<commit_message>
Correct electronic design contest year
</commit_message>
<xml_diff>
--- a/Xuehao_Xu_Research_CV_EN_v4_editable.docx
+++ b/Xuehao_Xu_Research_CV_EN_v4_editable.docx
@@ -532,7 +532,7 @@
           <w:sz w:val="18"/>
         </w:rPr>
         <w:tab/>
-        <w:t>2024</w:t>
+        <w:t>2025</w:t>
       </w:r>
     </w:p>
     <w:p>
@@ -12823,17 +12823,6 @@
         <w:shd w:val="clear" w:color="auto" w:fill="FBCAA2" w:themeFill="accent6" w:themeFillTint="7F"/>
       </w:tcPr>
     </w:tblStylePr>
-  </w:style>
-  <w:style w:type="paragraph" w:customStyle="1" w:styleId="Equation">
-    <w:name w:val="Equation"/>
-    <w:pPr>
-      <w:keepLines/>
-      <w:spacing w:before="80" w:after="80"/>
-    </w:pPr>
-    <w:rPr>
-      <w:rFonts w:ascii="Cambria Math" w:hAnsi="Cambria Math" w:eastAsia="Cambria Math" w:cs="Cambria Math"/>
-      <w:sz w:val="21"/>
-    </w:rPr>
   </w:style>
 </w:styles>
 </file>

</xml_diff>